<commit_message>
chore(dashboard): dọn artifact còn sót Sprint 3-4 + PDF export + build mới nhất
- Xuất PDF cho các tài liệu WF-FEATURE (BUG, DESIGN, DEPLOY, RESOURCE, SPRINT, US, UX-REVIEW, RESEARCH)
- Thêm 3 lesson Avalonia mới + 1 lesson python-tkinter (dashboard idle-state gotcha)
- Rebuild frontend dist với layout roster mới nhất (bold model, token+history 1 hàng, sort newest-first)
- .gitignore: loại trừ agent_dashboard.db runtime (rỗng, không phải source) + settings.local.json

Co-Authored-By: Claude Sonnet 5 <noreply@anthropic.com>
</commit_message>
<xml_diff>
--- a/docs/prd/PRD-agent-dashboard.docx
+++ b/docs/prd/PRD-agent-dashboard.docx
@@ -3600,6 +3600,229 @@
           </w:p>
         </w:tc>
       </w:tr>
+      <w:tr>
+        <w:tc>
+          <w:tcPr>
+            <w:tcW w:type="dxa" w:w="2422"/>
+            <w:shd w:val="clear" w:color="auto" w:fill="B8B3D6"/>
+            <w:tcBorders>
+              <w:top w:val="single" w:sz="4" w:space="0" w:color="CBCBCB"/>
+              <w:left w:val="single" w:sz="4" w:space="0" w:color="CBCBCB"/>
+              <w:bottom w:val="single" w:sz="4" w:space="0" w:color="CBCBCB"/>
+              <w:right w:val="single" w:sz="4" w:space="0" w:color="CBCBCB"/>
+            </w:tcBorders>
+          </w:tcPr>
+          <w:p>
+            <w:r>
+              <w:rPr>
+                <w:sz w:val="20"/>
+              </w:rPr>
+              <w:t>Q4</w:t>
+            </w:r>
+          </w:p>
+        </w:tc>
+        <w:tc>
+          <w:tcPr>
+            <w:tcW w:type="dxa" w:w="2422"/>
+            <w:shd w:val="clear" w:color="auto" w:fill="B8B3D6"/>
+            <w:tcBorders>
+              <w:top w:val="single" w:sz="4" w:space="0" w:color="CBCBCB"/>
+              <w:left w:val="single" w:sz="4" w:space="0" w:color="CBCBCB"/>
+              <w:bottom w:val="single" w:sz="4" w:space="0" w:color="CBCBCB"/>
+              <w:right w:val="single" w:sz="4" w:space="0" w:color="CBCBCB"/>
+            </w:tcBorders>
+          </w:tcPr>
+          <w:p>
+            <w:r>
+              <w:rPr>
+                <w:b/>
+                <w:sz w:val="20"/>
+              </w:rPr>
+              <w:t>F-07 Account Switcher hiện chỉ hỗ trợ tài khoản có API key (`ANTHROPIC_API_KEY`). Người dùng Claude Pro/Max (OAuth login, không có API key tĩnh) KHÔNG dùng được tính năng này.</w:t>
+            </w:r>
+          </w:p>
+        </w:tc>
+        <w:tc>
+          <w:tcPr>
+            <w:tcW w:type="dxa" w:w="2422"/>
+            <w:shd w:val="clear" w:color="auto" w:fill="B8B3D6"/>
+            <w:tcBorders>
+              <w:top w:val="single" w:sz="4" w:space="0" w:color="CBCBCB"/>
+              <w:left w:val="single" w:sz="4" w:space="0" w:color="CBCBCB"/>
+              <w:bottom w:val="single" w:sz="4" w:space="0" w:color="CBCBCB"/>
+              <w:right w:val="single" w:sz="4" w:space="0" w:color="CBCBCB"/>
+            </w:tcBorders>
+          </w:tcPr>
+          <w:p>
+            <w:r>
+              <w:rPr>
+                <w:sz w:val="20"/>
+              </w:rPr>
+              <w:t>High (gap phát hiện sau khi sprint 1 đã build xong)</w:t>
+            </w:r>
+          </w:p>
+        </w:tc>
+        <w:tc>
+          <w:tcPr>
+            <w:tcW w:type="dxa" w:w="2422"/>
+            <w:shd w:val="clear" w:color="auto" w:fill="B8B3D6"/>
+            <w:tcBorders>
+              <w:top w:val="single" w:sz="4" w:space="0" w:color="CBCBCB"/>
+              <w:left w:val="single" w:sz="4" w:space="0" w:color="CBCBCB"/>
+              <w:bottom w:val="single" w:sz="4" w:space="0" w:color="CBCBCB"/>
+              <w:right w:val="single" w:sz="4" w:space="0" w:color="CBCBCB"/>
+            </w:tcBorders>
+          </w:tcPr>
+          <w:p>
+            <w:r>
+              <w:rPr>
+                <w:b/>
+                <w:sz w:val="20"/>
+              </w:rPr>
+              <w:t>Backlog sprint 2:</w:t>
+            </w:r>
+            <w:r>
+              <w:rPr>
+                <w:sz w:val="20"/>
+              </w:rPr>
+              <w:t xml:space="preserve"> mở rộng Account Manager hỗ trợ thêm loại credential "OAuth Session" — lưu/switch giữa các session-token đã đăng nhập qua </w:t>
+            </w:r>
+            <w:r>
+              <w:rPr>
+                <w:rFonts w:ascii="Courier New" w:hAnsi="Courier New"/>
+                <w:color w:val="F05922"/>
+                <w:sz w:val="20"/>
+              </w:rPr>
+              <w:t>claude login</w:t>
+            </w:r>
+            <w:r>
+              <w:rPr>
+                <w:sz w:val="20"/>
+              </w:rPr>
+              <w:t>, thay vì chỉ API key tĩnh. Cần Tech Lead điều chỉnh TDD (data model + UI) trước khi Senior/Junior Dev code. Quyết định user (2026-08-06): triển khai SAU khi sprint 1 (API key only) đã qua QA/Deploy — không block release hiện tại.</w:t>
+            </w:r>
+          </w:p>
+        </w:tc>
+      </w:tr>
+      <w:tr>
+        <w:tc>
+          <w:tcPr>
+            <w:tcW w:type="dxa" w:w="2422"/>
+            <w:tcBorders>
+              <w:top w:val="single" w:sz="4" w:space="0" w:color="CBCBCB"/>
+              <w:left w:val="single" w:sz="4" w:space="0" w:color="CBCBCB"/>
+              <w:bottom w:val="single" w:sz="4" w:space="0" w:color="CBCBCB"/>
+              <w:right w:val="single" w:sz="4" w:space="0" w:color="CBCBCB"/>
+            </w:tcBorders>
+          </w:tcPr>
+          <w:p>
+            <w:r>
+              <w:rPr>
+                <w:sz w:val="20"/>
+              </w:rPr>
+              <w:t>Q4b</w:t>
+            </w:r>
+          </w:p>
+        </w:tc>
+        <w:tc>
+          <w:tcPr>
+            <w:tcW w:type="dxa" w:w="2422"/>
+            <w:tcBorders>
+              <w:top w:val="single" w:sz="4" w:space="0" w:color="CBCBCB"/>
+              <w:left w:val="single" w:sz="4" w:space="0" w:color="CBCBCB"/>
+              <w:bottom w:val="single" w:sz="4" w:space="0" w:color="CBCBCB"/>
+              <w:right w:val="single" w:sz="4" w:space="0" w:color="CBCBCB"/>
+            </w:tcBorders>
+          </w:tcPr>
+          <w:p>
+            <w:r>
+              <w:rPr>
+                <w:b/>
+                <w:sz w:val="20"/>
+              </w:rPr>
+              <w:t>Bản "đầy đủ" cho OAuth Session (quyết định user 2026-08-06):</w:t>
+            </w:r>
+            <w:r>
+              <w:rPr>
+                <w:sz w:val="20"/>
+              </w:rPr>
+              <w:t xml:space="preserve"> Không chỉ refresh tài khoản đang active (passive, giống Claude Code CLI mặc định) — mà chủ động background job tự refresh </w:t>
+            </w:r>
+            <w:r>
+              <w:rPr>
+                <w:b/>
+                <w:sz w:val="20"/>
+              </w:rPr>
+              <w:t>TẤT CẢ</w:t>
+            </w:r>
+            <w:r>
+              <w:rPr>
+                <w:sz w:val="20"/>
+              </w:rPr>
+              <w:t xml:space="preserve"> account OAuth đã lưu (kể cả không active), để khi user switch qua account nào cũng dùng ngay không cần đăng nhập lại.</w:t>
+            </w:r>
+          </w:p>
+        </w:tc>
+        <w:tc>
+          <w:tcPr>
+            <w:tcW w:type="dxa" w:w="2422"/>
+            <w:tcBorders>
+              <w:top w:val="single" w:sz="4" w:space="0" w:color="CBCBCB"/>
+              <w:left w:val="single" w:sz="4" w:space="0" w:color="CBCBCB"/>
+              <w:bottom w:val="single" w:sz="4" w:space="0" w:color="CBCBCB"/>
+              <w:right w:val="single" w:sz="4" w:space="0" w:color="CBCBCB"/>
+            </w:tcBorders>
+          </w:tcPr>
+          <w:p>
+            <w:r>
+              <w:rPr>
+                <w:sz w:val="20"/>
+              </w:rPr>
+              <w:t>High — cần R&amp;D trước khi TDD sprint 2, có rủi ro kỹ thuật chưa xác nhận</w:t>
+            </w:r>
+          </w:p>
+        </w:tc>
+        <w:tc>
+          <w:tcPr>
+            <w:tcW w:type="dxa" w:w="2422"/>
+            <w:tcBorders>
+              <w:top w:val="single" w:sz="4" w:space="0" w:color="CBCBCB"/>
+              <w:left w:val="single" w:sz="4" w:space="0" w:color="CBCBCB"/>
+              <w:bottom w:val="single" w:sz="4" w:space="0" w:color="CBCBCB"/>
+              <w:right w:val="single" w:sz="4" w:space="0" w:color="CBCBCB"/>
+            </w:tcBorders>
+          </w:tcPr>
+          <w:p>
+            <w:r>
+              <w:rPr>
+                <w:b/>
+                <w:sz w:val="20"/>
+              </w:rPr>
+              <w:t>Cần Tech Lead/Senior Developer research (R&amp;D spike) trước khi TDD sprint 2</w:t>
+            </w:r>
+            <w:r>
+              <w:rPr>
+                <w:sz w:val="20"/>
+              </w:rPr>
+              <w:t xml:space="preserve">, làm rõ: (1) Anthropic có rotate refresh_token mỗi lần dùng không (nếu có → phải ghi đè token mới vào storage ngay sau mỗi lần refresh, tuyệt đối không refresh trùng 1 token 2 lần song song vì lần sau sẽ vô hiệu lần trước); (2) tần suất polling hợp lý (đề xuất: refresh khi access_token còn ~20% thời gian sống, không phải theo lịch cố định); (3) xử lý khi 1 account bị revoke/logout từ nơi khác — job phải phát hiện lỗi refresh và đánh dấu account đó "cần đăng nhập lại" thay vì retry vô hạn; (4) rủi ro bảo mật khi lưu nhiều refresh_token còn hiệu lực cùng lúc trên máy local — vẫn theo mức bảo mật đơn giản đã chốt (mã hoá nhẹ, không OS keychain) nhưng cần cảnh báo rõ trong Account Manager UI. Không tự phỏng đoán chi tiết endpoint/protocol nội bộ của Anthropic — phải verify thực tế bằng cách bắt log traffic của </w:t>
+            </w:r>
+            <w:r>
+              <w:rPr>
+                <w:rFonts w:ascii="Courier New" w:hAnsi="Courier New"/>
+                <w:color w:val="F05922"/>
+                <w:sz w:val="20"/>
+              </w:rPr>
+              <w:t>claude login</w:t>
+            </w:r>
+            <w:r>
+              <w:rPr>
+                <w:sz w:val="20"/>
+              </w:rPr>
+              <w:t>/CLI trước khi code, không suy diễn.</w:t>
+            </w:r>
+          </w:p>
+        </w:tc>
+      </w:tr>
     </w:tbl>
     <w:p/>
     <w:p>

</xml_diff>